<commit_message>
PROFANE ATTACK v1.3: every conquered place also gives its own treasure
- after the gold/relics/crosses screen of a win: AND ALSO YOU GOT: (2 s),
  then the treasure of the place (DATA lines 980-986)
- the tape recording now holds the program without its REM lines (4330
  bytes), leaving about 1.6 KB for the variables on a PC-1500A
- README and instructions updated (treasures, memory, file names)

Co-Authored-By: Claude Opus 5.5 <noreply@anthropic.com>
Claude-Session: https://claude.ai/code/session_014MnrG7cc1Hws3poqmcDFnM
</commit_message>
<xml_diff>
--- a/instructions.docx
+++ b/instructions.docx
@@ -45,7 +45,7 @@
           <w:sz w:val="22"/>
           <w:szCs w:val="22"/>
         </w:rPr>
-        <w:t xml:space="preserve">Instructions – version 1.2</w:t>
+        <w:t xml:space="preserve">Instructions – version 1.3</w:t>
       </w:r>
     </w:p>
     <w:p>
@@ -61,7 +61,7 @@
         <w:spacing w:after="120"/>
       </w:pPr>
       <w:r>
-        <w:t xml:space="preserve">The CC holds ten places, numbered 0 to 9. Each place is defended by militants and keeps relics and gold. You lead atheists, mercenaries and jihadists, armed with inverted crosses and brimstones. Conquer all ten places to win the war.</w:t>
+        <w:t xml:space="preserve">The CATHODIC CHURCH (CC) holds ten places, numbered 0 to 9, from Lourdes to the Vatican. Each place is defended by militants and keeps valuable relics and gold. You lead atheists, mercenaries and jihadists, armed with inverted crosses and brimstones. Conquer all ten places to win the war.</w:t>
       </w:r>
     </w:p>
     <w:p>
@@ -79,7 +79,7 @@
         <w:t xml:space="preserve">rich places</w:t>
       </w:r>
       <w:r>
-        <w:t xml:space="preserve">: they start with twice as many militants, relics and gold.</w:t>
+        <w:t xml:space="preserve">: they start with twice as many militants, relics and gold. The richest is the Vatican (place 9). Every place also hides its own treasure.</w:t>
       </w:r>
     </w:p>
     <w:p>
@@ -130,7 +130,7 @@
         <w:t xml:space="preserve">Tandy PC-2</w:t>
       </w:r>
       <w:r>
-        <w:t xml:space="preserve"> with a RAM module (CE-151 or larger). The program takes 4822 bytes and needs about 5.5 KB of memory with its variables, so it does not fit into a PC-1500 or PC-2 without a module.</w:t>
+        <w:t xml:space="preserve"> with a RAM module (CE-151 or larger). The recording holds the program without its REM lines (4330 bytes); with its variables it needs about 5 KB of memory, so it does not fit into a PC-1500 or PC-2 without a module.</w:t>
       </w:r>
     </w:p>
     <w:p>
@@ -234,7 +234,7 @@
         <w:rPr>
           <w:rFonts w:ascii="Courier New" w:cs="Courier New" w:eastAsia="Courier New" w:hAnsi="Courier New"/>
         </w:rPr>
-        <w:t xml:space="preserve">profane_attack-v1.2.wav</w:t>
+        <w:t xml:space="preserve">profane_attack-v1.3.wav</w:t>
       </w:r>
       <w:r>
         <w:t xml:space="preserve"> (name on the tape: </w:t>
@@ -246,7 +246,7 @@
         <w:t xml:space="preserve">PROFANE</w:t>
       </w:r>
       <w:r>
-        <w:t xml:space="preserve">, about 6 minutes). If the program does not load, try again with another volume.</w:t>
+        <w:t xml:space="preserve">, about 5 minutes). If the program does not load, try again with another volume.</w:t>
       </w:r>
     </w:p>
     <w:p>
@@ -282,10 +282,10 @@
         <w:rPr>
           <w:rFonts w:ascii="Courier New" w:cs="Courier New" w:eastAsia="Courier New" w:hAnsi="Courier New"/>
         </w:rPr>
-        <w:t xml:space="preserve">profane_attack-v1.2.txt</w:t>
-      </w:r>
-      <w:r>
-        <w:t xml:space="preserve">. The place names in lines 970 and 975 contain small letters (SML key). The REM lines can be left out.</w:t>
+        <w:t xml:space="preserve">profane_attack-v1.3.txt</w:t>
+      </w:r>
+      <w:r>
+        <w:t xml:space="preserve">. Leave out the REM lines: the recording does not contain them either, and with them the program would fill almost all the memory of a PC-1500A. The place names and treasures in lines 970–986 contain small letters (SML key).</w:t>
       </w:r>
     </w:p>
     <w:p>
@@ -3233,6 +3233,42 @@
           <w:sz w:val="22"/>
           <w:szCs w:val="22"/>
         </w:rPr>
+        <w:t xml:space="preserve">AND ALSO YOU GOT:</w:t>
+      </w:r>
+    </w:p>
+    <w:p>
+      <w:pPr>
+        <w:pStyle w:val="ListParagraph"/>
+        <w:numPr>
+          <w:ilvl w:val="1"/>
+          <w:numId w:val="2"/>
+        </w:numPr>
+        <w:spacing w:after="60"/>
+      </w:pPr>
+      <w:r>
+        <w:t xml:space="preserve">shown for two seconds, then the treasure of the place, e.g. </w:t>
+      </w:r>
+      <w:r>
+        <w:rPr>
+          <w:rFonts w:ascii="Courier New" w:cs="Courier New" w:eastAsia="Courier New" w:hAnsi="Courier New"/>
+        </w:rPr>
+        <w:t xml:space="preserve">barrel of holy water</w:t>
+      </w:r>
+      <w:r>
+        <w:t xml:space="preserve"> at Lourdes. Every place has its own treasure; it is a trophy and does not change your resources;</w:t>
+      </w:r>
+    </w:p>
+    <w:p>
+      <w:pPr>
+        <w:spacing w:after="40"/>
+        <w:ind w:left="567"/>
+      </w:pPr>
+      <w:r>
+        <w:rPr>
+          <w:rFonts w:ascii="Courier New" w:cs="Courier New" w:eastAsia="Courier New" w:hAnsi="Courier New"/>
+          <w:sz w:val="22"/>
+          <w:szCs w:val="22"/>
+        </w:rPr>
         <w:t xml:space="preserve">LOST: m MERC a ATH j JIH</w:t>
       </w:r>
     </w:p>
@@ -4211,7 +4247,7 @@
         <w:sz w:val="18"/>
         <w:szCs w:val="18"/>
       </w:rPr>
-      <w:t xml:space="preserve">PROFANE ATTACK v1.2 – page </w:t>
+      <w:t xml:space="preserve">PROFANE ATTACK v1.3 – page </w:t>
     </w:r>
     <w:r>
       <w:rPr>

</xml_diff>

<commit_message>
Instructions: new descriptions of the inverted cross and the brimstone
Co-Authored-By: Claude Opus 5.5 <noreply@anthropic.com>
Claude-Session: https://claude.ai/code/session_014MnrG7cc1Hws3poqmcDFnM
</commit_message>
<xml_diff>
--- a/instructions.docx
+++ b/instructions.docx
@@ -1293,10 +1293,10 @@
           <w:b/>
           <w:bCs/>
         </w:rPr>
-        <w:t xml:space="preserve">Inverted cross</w:t>
-      </w:r>
-      <w:r>
-        <w:t xml:space="preserve">: can eliminate one militant in each round of a fight.</w:t>
+        <w:t xml:space="preserve">Inverted Cross</w:t>
+      </w:r>
+      <w:r>
+        <w:t xml:space="preserve">: instils terror and allows you to eliminate one fighter in each round of combat.</w:t>
       </w:r>
     </w:p>
     <w:p>
@@ -1316,7 +1316,7 @@
         <w:t xml:space="preserve">Brimstone</w:t>
       </w:r>
       <w:r>
-        <w:t xml:space="preserve">: can eliminate three militants in each round.</w:t>
+        <w:t xml:space="preserve">: has a deadly effect with sulphur, which terrifies Cathodics, and allows you to eliminate three fighters in each round.</w:t>
       </w:r>
     </w:p>
     <w:p>
@@ -1329,17 +1329,14 @@
         <w:spacing w:after="60"/>
       </w:pPr>
       <w:r>
-        <w:t xml:space="preserve">A </w:t>
-      </w:r>
-      <w:r>
         <w:rPr>
           <w:b/>
           <w:bCs/>
         </w:rPr>
-        <w:t xml:space="preserve">jihadist</w:t>
-      </w:r>
-      <w:r>
-        <w:t xml:space="preserve"> can eliminate five militants in each round.</w:t>
+        <w:t xml:space="preserve">Jihadist</w:t>
+      </w:r>
+      <w:r>
+        <w:t xml:space="preserve">: allows you to eliminate five fighters in each round.</w:t>
       </w:r>
     </w:p>
     <w:p>

</xml_diff>

<commit_message>
PROFANE ATTACK v1.4: battle animation twice, YOU WON!/YOU LOST! centred
- the armies march across the display twice, with a beep each time
  they meet (lines 270-272)
- YOU WON! and YOU LOST! in the middle of the display (CURSOR 9 / 8)
- new tape recording (4367 bytes without REM lines), README and
  instructions updated for v1.4

Co-Authored-By: Claude Opus 5.5 <noreply@anthropic.com>
Claude-Session: https://claude.ai/code/session_014MnrG7cc1Hws3poqmcDFnM
</commit_message>
<xml_diff>
--- a/instructions.docx
+++ b/instructions.docx
@@ -45,7 +45,7 @@
           <w:sz w:val="22"/>
           <w:szCs w:val="22"/>
         </w:rPr>
-        <w:t xml:space="preserve">Instructions – version 1.3</w:t>
+        <w:t xml:space="preserve">Instructions – version 1.4</w:t>
       </w:r>
     </w:p>
     <w:p>
@@ -230,7 +230,7 @@
         <w:t xml:space="preserve">Tandy PC-2</w:t>
       </w:r>
       <w:r>
-        <w:t xml:space="preserve"> with a RAM module (CE-151 or larger). The recording holds the program without its REM lines (4330 bytes); with its variables it needs about 5 KB of memory, so it does not fit into a PC-1500 or PC-2 without a module.</w:t>
+        <w:t xml:space="preserve"> with a RAM module (CE-151 or larger). The recording holds the program without its REM lines (4367 bytes); with its variables it needs about 5 KB of memory, so it does not fit into a PC-1500 or PC-2 without a module.</w:t>
       </w:r>
     </w:p>
     <w:p>
@@ -334,7 +334,7 @@
         <w:rPr>
           <w:rFonts w:ascii="Courier New" w:cs="Courier New" w:eastAsia="Courier New" w:hAnsi="Courier New"/>
         </w:rPr>
-        <w:t xml:space="preserve">profane_attack-v1.3.wav</w:t>
+        <w:t xml:space="preserve">profane_attack-v1.4.wav</w:t>
       </w:r>
       <w:r>
         <w:t xml:space="preserve"> (name on the tape: </w:t>
@@ -382,7 +382,7 @@
         <w:rPr>
           <w:rFonts w:ascii="Courier New" w:cs="Courier New" w:eastAsia="Courier New" w:hAnsi="Courier New"/>
         </w:rPr>
-        <w:t xml:space="preserve">profane_attack-v1.3.txt</w:t>
+        <w:t xml:space="preserve">profane_attack-v1.4.txt</w:t>
       </w:r>
       <w:r>
         <w:t xml:space="preserve">. Leave out the REM lines: the recording does not contain them either, and with them the program would fill almost all the memory of a PC-1500A. The place names and treasures in lines 970–986 contain small letters (SML key).</w:t>
@@ -3282,7 +3282,7 @@
         <w:spacing w:after="60"/>
       </w:pPr>
       <w:r>
-        <w:t xml:space="preserve">Your army and the militants march from both sides of the display; when they meet, the battle begins (beep) and the game shows </w:t>
+        <w:t xml:space="preserve">Your army and the militants march twice from both sides of the display; each time they meet, the game beeps. Then it shows </w:t>
       </w:r>
       <w:r>
         <w:rPr>
@@ -4468,7 +4468,7 @@
         <w:sz w:val="18"/>
         <w:szCs w:val="18"/>
       </w:rPr>
-      <w:t xml:space="preserve">PROFANE ATTACK v1.3 – page </w:t>
+      <w:t xml:space="preserve">PROFANE ATTACK v1.4 – page </w:t>
     </w:r>
     <w:r>
       <w:rPr>

</xml_diff>

<commit_message>
Instructions v1.4: the author's version with v1.4 details and a new PDF
- version 1.4, recording 4367 bytes, v1.4 file names, footer v1.4
- the battle animation runs twice, with a beep each time the armies meet
- intro: you start with atheists and mercenaries; volunteers join as you
  conquer places; only jihadists can be bought (not mercenaries)
- en dashes around "a fictional organisation"; two empty paragraphs removed
- instructions.pdf made from this DOCX

Co-Authored-By: Claude Opus 5.5 <noreply@anthropic.com>
Claude-Session: https://claude.ai/code/session_014MnrG7cc1Hws3poqmcDFnM
</commit_message>
<xml_diff>
--- a/instructions.docx
+++ b/instructions.docx
@@ -54,7 +54,7 @@
           <w:color w:val="555555"/>
           <w:lang w:val="en-GB"/>
         </w:rPr>
-        <w:t>Instructions – version 1.3</w:t>
+        <w:t>Instructions – version 1.4</w:t>
       </w:r>
     </w:p>
     <w:p>
@@ -82,37 +82,7 @@
         <w:rPr>
           <w:lang w:val="en-GB"/>
         </w:rPr>
-        <w:t>The Cathodic Church (CC</w:t>
-      </w:r>
-      <w:r>
-        <w:rPr>
-          <w:lang w:val="en-GB"/>
-        </w:rPr>
-        <w:t>)</w:t>
-      </w:r>
-      <w:r>
-        <w:rPr>
-          <w:lang w:val="en-GB"/>
-        </w:rPr>
-        <w:t xml:space="preserve"> -</w:t>
-      </w:r>
-      <w:r>
-        <w:rPr>
-          <w:lang w:val="en-GB"/>
-        </w:rPr>
-        <w:t xml:space="preserve"> a fictional organisation</w:t>
-      </w:r>
-      <w:r>
-        <w:rPr>
-          <w:lang w:val="en-GB"/>
-        </w:rPr>
-        <w:t xml:space="preserve"> -</w:t>
-      </w:r>
-      <w:r>
-        <w:rPr>
-          <w:lang w:val="en-GB"/>
-        </w:rPr>
-        <w:t xml:space="preserve"> holds ten places, numbered 0 to 9: </w:t>
+        <w:t xml:space="preserve">The Cathodic Church (CC) – a fictional organisation – holds ten places, numbered 0 to 9: </w:t>
       </w:r>
       <w:r>
         <w:rPr>
@@ -142,7 +112,6 @@
         </w:rPr>
         <w:t xml:space="preserve"> (Portugal), </w:t>
       </w:r>
-      <w:proofErr w:type="spellStart"/>
       <w:r>
         <w:rPr>
           <w:b/>
@@ -151,7 +120,6 @@
         </w:rPr>
         <w:t>Altotting</w:t>
       </w:r>
-      <w:proofErr w:type="spellEnd"/>
       <w:r>
         <w:rPr>
           <w:lang w:val="en-GB"/>
@@ -214,7 +182,6 @@
         </w:rPr>
         <w:t xml:space="preserve"> (Italy), </w:t>
       </w:r>
-      <w:proofErr w:type="spellStart"/>
       <w:r>
         <w:rPr>
           <w:b/>
@@ -223,14 +190,12 @@
         </w:rPr>
         <w:t>Hohensalzburg</w:t>
       </w:r>
-      <w:proofErr w:type="spellEnd"/>
       <w:r>
         <w:rPr>
           <w:lang w:val="en-GB"/>
         </w:rPr>
         <w:t xml:space="preserve"> (Austria), </w:t>
       </w:r>
-      <w:proofErr w:type="spellStart"/>
       <w:r>
         <w:rPr>
           <w:b/>
@@ -239,7 +204,6 @@
         </w:rPr>
         <w:t>Weltenburg</w:t>
       </w:r>
-      <w:proofErr w:type="spellEnd"/>
       <w:r>
         <w:rPr>
           <w:lang w:val="en-GB"/>
@@ -258,43 +222,7 @@
         <w:rPr>
           <w:lang w:val="en-GB"/>
         </w:rPr>
-        <w:t xml:space="preserve">. Each place is defended by militants and keeps valuable relics and gold. You lead </w:t>
-      </w:r>
-      <w:r>
-        <w:rPr>
-          <w:lang w:val="en-GB"/>
-        </w:rPr>
-        <w:t xml:space="preserve">a small group of </w:t>
-      </w:r>
-      <w:r>
-        <w:rPr>
-          <w:lang w:val="en-GB"/>
-        </w:rPr>
-        <w:t xml:space="preserve">atheists, mercenaries and jihadists, armed with inverted crosses and brimstones. </w:t>
-      </w:r>
-      <w:r>
-        <w:rPr>
-          <w:lang w:val="en-GB"/>
-        </w:rPr>
-        <w:t>New volunteer will join you, and you can buy mercenaries and jihadists (</w:t>
-      </w:r>
-      <w:r>
-        <w:rPr>
-          <w:lang w:val="en-GB"/>
-        </w:rPr>
-        <w:t>steadfast and valiant warriors</w:t>
-      </w:r>
-      <w:r>
-        <w:rPr>
-          <w:lang w:val="en-GB"/>
-        </w:rPr>
-        <w:t xml:space="preserve">). </w:t>
-      </w:r>
-      <w:r>
-        <w:rPr>
-          <w:lang w:val="en-GB"/>
-        </w:rPr>
-        <w:t>Conquer all ten places to win the war.</w:t>
+        <w:t xml:space="preserve">. Each place is defended by militants and keeps valuable relics and gold. You lead a small group of atheists and mercenaries, armed with inverted crosses and brimstones. New volunteers join you as you conquer places, and you can buy jihadists (steadfast and valiant warriors). Conquer all ten places to win the war.</w:t>
       </w:r>
     </w:p>
     <w:p>
@@ -391,7 +319,7 @@
         <w:rPr>
           <w:lang w:val="en-GB"/>
         </w:rPr>
-        <w:t xml:space="preserve"> with a RAM module (CE-151 or larger). The recording holds the program without its REM lines (4330 bytes); with its variables it needs about 5 KB of memory, so it does not fit into a PC-1500 or PC-2 without a module.</w:t>
+        <w:t xml:space="preserve"> with a RAM module (CE-151 or larger). The recording holds the program without its REM lines (4367 bytes); with its variables it needs about 5 KB of memory, so it does not fit into a PC-1500 or PC-2 without a module.</w:t>
       </w:r>
     </w:p>
     <w:p>
@@ -536,7 +464,7 @@
           <w:rFonts w:ascii="Courier New" w:eastAsia="Courier New" w:hAnsi="Courier New" w:cs="Courier New"/>
           <w:lang w:val="en-GB"/>
         </w:rPr>
-        <w:t>profane_attack-v1.3.wav</w:t>
+        <w:t>profane_attack-v1.4.wav</w:t>
       </w:r>
       <w:r>
         <w:rPr>
@@ -608,7 +536,7 @@
           <w:rFonts w:ascii="Courier New" w:eastAsia="Courier New" w:hAnsi="Courier New" w:cs="Courier New"/>
           <w:lang w:val="en-GB"/>
         </w:rPr>
-        <w:t>profane_attack-v1.3.txt</w:t>
+        <w:t>profane_attack-v1.4.txt</w:t>
       </w:r>
       <w:r>
         <w:rPr>
@@ -1758,30 +1686,8 @@
         <w:rPr>
           <w:lang w:val="en-GB"/>
         </w:rPr>
-        <w:t xml:space="preserve"> fight in every fight, without being chosen, and stay with you until they are killed. Militants hunt them too, but less often.</w:t>
-      </w:r>
-      <w:r>
-        <w:rPr>
-          <w:lang w:val="en-GB"/>
-        </w:rPr>
-        <w:t xml:space="preserve"> Each jihadist </w:t>
-      </w:r>
-      <w:r>
-        <w:rPr>
-          <w:lang w:val="en-GB"/>
-        </w:rPr>
-        <w:t>allows you to eliminate five fighters in each round.</w:t>
-      </w:r>
-    </w:p>
-    <w:p>
-      <w:pPr>
-        <w:pStyle w:val="Akapitzlist"/>
-        <w:spacing w:after="60"/>
-        <w:ind w:left="567"/>
-        <w:rPr>
-          <w:lang w:val="en-GB"/>
-        </w:rPr>
-      </w:pPr>
+        <w:t xml:space="preserve"> fight in every fight, without being chosen, and stay with you until they are killed. Militants hunt them too, but less often. Each jihadist allows you to eliminate five fighters in each round.</w:t>
+      </w:r>
     </w:p>
     <w:p>
       <w:pPr>
@@ -1794,31 +1700,7 @@
         <w:rPr>
           <w:lang w:val="en-GB"/>
         </w:rPr>
-        <w:t>Your people are atheists + mercenaries + jihadists. When all of them are gone, the C</w:t>
-      </w:r>
-      <w:r>
-        <w:rPr>
-          <w:lang w:val="en-GB"/>
-        </w:rPr>
-        <w:t xml:space="preserve">athodic </w:t>
-      </w:r>
-      <w:r>
-        <w:rPr>
-          <w:lang w:val="en-GB"/>
-        </w:rPr>
-        <w:t>C</w:t>
-      </w:r>
-      <w:r>
-        <w:rPr>
-          <w:lang w:val="en-GB"/>
-        </w:rPr>
-        <w:t>hurch (CC)</w:t>
-      </w:r>
-      <w:r>
-        <w:rPr>
-          <w:lang w:val="en-GB"/>
-        </w:rPr>
-        <w:t xml:space="preserve"> wins.</w:t>
+        <w:t xml:space="preserve">Your people are atheists + mercenaries + jihadists. When all of them are gone, the Cathodic Church (CC) wins.</w:t>
       </w:r>
     </w:p>
     <w:p>
@@ -1853,27 +1735,7 @@
         <w:rPr>
           <w:lang w:val="en-GB"/>
         </w:rPr>
-        <w:t xml:space="preserve"> instils terror</w:t>
-      </w:r>
-      <w:r>
-        <w:rPr>
-          <w:lang w:val="en-GB"/>
-        </w:rPr>
-        <w:t xml:space="preserve"> among </w:t>
-      </w:r>
-      <w:proofErr w:type="spellStart"/>
-      <w:r>
-        <w:rPr>
-          <w:lang w:val="en-GB"/>
-        </w:rPr>
-        <w:t>Cathodics</w:t>
-      </w:r>
-      <w:proofErr w:type="spellEnd"/>
-      <w:r>
-        <w:rPr>
-          <w:lang w:val="en-GB"/>
-        </w:rPr>
-        <w:t xml:space="preserve"> and allows you to eliminate one fighter in each round of combat.</w:t>
+        <w:t xml:space="preserve"> instils terror among Cathodics and allows you to eliminate one fighter in each round of combat.</w:t>
       </w:r>
     </w:p>
     <w:p>
@@ -1900,32 +1762,8 @@
         <w:rPr>
           <w:lang w:val="en-GB"/>
         </w:rPr>
-        <w:t xml:space="preserve"> has a deadly effect with demonic sulphur, which terrifies </w:t>
-      </w:r>
-      <w:proofErr w:type="spellStart"/>
-      <w:r>
-        <w:rPr>
-          <w:lang w:val="en-GB"/>
-        </w:rPr>
-        <w:t>Cathodics</w:t>
-      </w:r>
-      <w:proofErr w:type="spellEnd"/>
-      <w:r>
-        <w:rPr>
-          <w:lang w:val="en-GB"/>
-        </w:rPr>
-        <w:t>, and allows you to eliminate three fighters in each round.</w:t>
-      </w:r>
-    </w:p>
-    <w:p>
-      <w:pPr>
-        <w:pStyle w:val="Akapitzlist"/>
-        <w:spacing w:after="60"/>
-        <w:ind w:left="567"/>
-        <w:rPr>
-          <w:lang w:val="en-GB"/>
-        </w:rPr>
-      </w:pPr>
+        <w:t xml:space="preserve"> has a deadly effect with demonic sulphur, which terrifies Cathodics, and allows you to eliminate three fighters in each round.</w:t>
+      </w:r>
     </w:p>
     <w:p>
       <w:pPr>
@@ -3671,23 +3509,7 @@
           <w:rFonts w:ascii="Courier New" w:eastAsia="Courier New" w:hAnsi="Courier New" w:cs="Courier New"/>
           <w:lang w:val="en-GB"/>
         </w:rPr>
-        <w:t xml:space="preserve">2 </w:t>
-      </w:r>
-      <w:proofErr w:type="spellStart"/>
-      <w:r>
-        <w:rPr>
-          <w:rFonts w:ascii="Courier New" w:eastAsia="Courier New" w:hAnsi="Courier New" w:cs="Courier New"/>
-          <w:lang w:val="en-GB"/>
-        </w:rPr>
-        <w:t>Altotting</w:t>
-      </w:r>
-      <w:proofErr w:type="spellEnd"/>
-      <w:r>
-        <w:rPr>
-          <w:rFonts w:ascii="Courier New" w:eastAsia="Courier New" w:hAnsi="Courier New" w:cs="Courier New"/>
-          <w:lang w:val="en-GB"/>
-        </w:rPr>
-        <w:t>: 25 MIL</w:t>
+        <w:t xml:space="preserve">2 Altotting: 25 MIL</w:t>
       </w:r>
       <w:r>
         <w:rPr>
@@ -3918,7 +3740,7 @@
         <w:rPr>
           <w:lang w:val="en-GB"/>
         </w:rPr>
-        <w:t xml:space="preserve">Your army and the militants march from both sides of the display; when they meet, the battle begins (beep) and the game shows </w:t>
+        <w:t xml:space="preserve">Your army and the militants march twice from both sides of the display; each time they meet, the game beeps. Then it shows </w:t>
       </w:r>
       <w:r>
         <w:rPr>
@@ -4246,21 +4068,7 @@
         <w:rPr>
           <w:lang w:val="en-GB"/>
         </w:rPr>
-        <w:t xml:space="preserve">A quarter of the militants of the place join you as mercenaries. A place with a lot of gold can also bring you </w:t>
-      </w:r>
-      <w:proofErr w:type="spellStart"/>
-      <w:r>
-        <w:rPr>
-          <w:lang w:val="en-GB"/>
-        </w:rPr>
-        <w:t>new</w:t>
-      </w:r>
-      <w:proofErr w:type="spellEnd"/>
-      <w:r>
-        <w:rPr>
-          <w:lang w:val="en-GB"/>
-        </w:rPr>
-        <w:t xml:space="preserve"> atheists, because Cathodic people were outraged by how much gold was stored there.</w:t>
+        <w:t xml:space="preserve">A quarter of the militants of the place join you as mercenaries. A place with a lot of gold can also bring you new atheists, because Cathodic people were outraged by how much gold was stored there.</w:t>
       </w:r>
     </w:p>
     <w:p>
@@ -5451,7 +5259,7 @@
         <w:sz w:val="18"/>
         <w:szCs w:val="18"/>
       </w:rPr>
-      <w:t xml:space="preserve">PROFANE ATTACK v1.3 – page </w:t>
+      <w:t xml:space="preserve">PROFANE ATTACK v1.4 – page </w:t>
     </w:r>
     <w:r>
       <w:rPr>

</xml_diff>